<commit_message>
docs: refine project documentation
</commit_message>
<xml_diff>
--- a/docs/dy_engine_보고서_DyD팀.docx
+++ b/docs/dy_engine_보고서_DyD팀.docx
@@ -3187,7 +3187,7 @@
                 <w:szCs w:val="24"/>
                 <w:lang w:eastAsia="ko-KR"/>
               </w:rPr>
-              <w:t>그림자 구현 기술</w:t>
+              <w:t>그림자 구현</w:t>
             </w:r>
             <w:r>
               <w:rPr>
@@ -3949,7 +3949,18 @@
                 <w:szCs w:val="24"/>
                 <w:lang w:eastAsia="ko-KR"/>
               </w:rPr>
-              <w:t xml:space="preserve">6 </w:t>
+              <w:t>6</w:t>
+            </w:r>
+            <w:r>
+              <w:rPr>
+                <w:rFonts w:ascii="휴먼명조" w:cs="HCI Poppy" w:hint="eastAsia"/>
+                <w:spacing w:val="-6"/>
+                <w:w w:val="100"/>
+                <w:sz w:val="24"/>
+                <w:szCs w:val="24"/>
+                <w:lang w:eastAsia="ko-KR"/>
+              </w:rPr>
+              <w:t xml:space="preserve"> </w:t>
             </w:r>
             <w:r>
               <w:rPr>
@@ -3960,18 +3971,7 @@
                 <w:szCs w:val="24"/>
                 <w:lang w:eastAsia="ko-KR"/>
               </w:rPr>
-              <w:t>병목(Bottleneck) 시나리오</w:t>
-            </w:r>
-            <w:r>
-              <w:rPr>
-                <w:rFonts w:ascii="휴먼명조" w:cs="HCI Poppy" w:hint="eastAsia"/>
-                <w:spacing w:val="-6"/>
-                <w:w w:val="100"/>
-                <w:sz w:val="24"/>
-                <w:szCs w:val="24"/>
-                <w:lang w:eastAsia="ko-KR"/>
-              </w:rPr>
-              <w:t xml:space="preserve"> 해소</w:t>
+              <w:t>설계 원칙</w:t>
             </w:r>
             <w:r>
               <w:rPr>
@@ -4002,7 +4002,7 @@
               <w:spacing w:before="0" w:after="0" w:line="257" w:lineRule="auto"/>
               <w:ind w:left="821" w:hanging="821"/>
               <w:rPr>
-                <w:rFonts w:ascii="휴먼명조"/>
+                <w:rFonts w:ascii="휴먼명조" w:hint="eastAsia"/>
                 <w:w w:val="100"/>
                 <w:sz w:val="24"/>
                 <w:szCs w:val="24"/>
@@ -4675,23 +4675,6 @@
     </w:tbl>
     <w:p>
       <w:pPr>
-        <w:widowControl/>
-        <w:wordWrap/>
-        <w:autoSpaceDE/>
-        <w:autoSpaceDN/>
-        <w:rPr>
-          <w:rFonts w:ascii="휴먼명조" w:eastAsia="휴먼명조" w:hAnsi="Arial Unicode MS" w:cs="HYSinMyeongJo-Medium"/>
-          <w:b/>
-          <w:bCs/>
-          <w:color w:val="000000"/>
-          <w:sz w:val="32"/>
-          <w:szCs w:val="32"/>
-          <w:lang w:eastAsia="ko-KR"/>
-        </w:rPr>
-      </w:pPr>
-    </w:p>
-    <w:p>
-      <w:pPr>
         <w:pStyle w:val="af"/>
         <w:wordWrap/>
         <w:spacing w:line="360" w:lineRule="auto"/>
@@ -4711,6 +4694,7 @@
           <w:szCs w:val="32"/>
           <w:lang w:eastAsia="ko-KR"/>
         </w:rPr>
+        <w:lastRenderedPageBreak/>
         <w:t>Ⅰ</w:t>
       </w:r>
       <w:r>
@@ -4884,6 +4868,23 @@
         </w:rPr>
         <w:t xml:space="preserve"> 아래의 사진은 OOP 구조가 가지는 가상함수 테이블 구조와 그에 따른 숨겨진 비용들이 어떻게 캐시 미스를 유발하는지에 대한 컨퍼런스의 한 장면입니다.</w:t>
       </w:r>
+    </w:p>
+    <w:p>
+      <w:pPr>
+        <w:pStyle w:val="a9"/>
+        <w:tabs>
+          <w:tab w:val="right" w:leader="middleDot" w:pos="9290"/>
+        </w:tabs>
+        <w:wordWrap/>
+        <w:spacing w:line="360" w:lineRule="auto"/>
+        <w:jc w:val="left"/>
+        <w:rPr>
+          <w:rFonts w:ascii="휴먼명조" w:eastAsia="휴먼명조" w:cs="휴먼명조"/>
+          <w:sz w:val="24"/>
+          <w:szCs w:val="24"/>
+          <w:lang w:eastAsia="ko-KR"/>
+        </w:rPr>
+      </w:pPr>
     </w:p>
     <w:p>
       <w:pPr>
@@ -15869,6 +15870,39 @@
         </w:tabs>
         <w:spacing w:line="360" w:lineRule="auto"/>
         <w:rPr>
+          <w:rFonts w:ascii="휴먼명조" w:eastAsia="휴먼명조" w:cs="휴먼명조" w:hint="eastAsia"/>
+          <w:b/>
+          <w:bCs/>
+          <w:sz w:val="24"/>
+          <w:szCs w:val="24"/>
+          <w:lang w:eastAsia="ko-KR"/>
+        </w:rPr>
+      </w:pPr>
+      <w:r>
+        <w:rPr>
+          <w:rFonts w:ascii="휴먼명조" w:eastAsia="휴먼명조" w:cs="휴먼명조" w:hint="eastAsia"/>
+          <w:b/>
+          <w:bCs/>
+          <w:sz w:val="24"/>
+          <w:szCs w:val="24"/>
+          <w:lang w:eastAsia="ko-KR"/>
+        </w:rPr>
+        <w:lastRenderedPageBreak/>
+        <w:t>4</w:t>
+      </w:r>
+      <w:r>
+        <w:rPr>
+          <w:rFonts w:ascii="휴먼명조" w:eastAsia="휴먼명조" w:cs="휴먼명조" w:hint="eastAsia"/>
+          <w:b/>
+          <w:bCs/>
+          <w:sz w:val="24"/>
+          <w:szCs w:val="24"/>
+          <w:lang w:eastAsia="ko-KR"/>
+        </w:rPr>
+        <w:t xml:space="preserve">. </w:t>
+      </w:r>
+      <w:r>
+        <w:rPr>
           <w:rFonts w:ascii="휴먼명조" w:eastAsia="휴먼명조" w:cs="휴먼명조"/>
           <w:b/>
           <w:bCs/>
@@ -15876,29 +15910,7 @@
           <w:szCs w:val="24"/>
           <w:lang w:eastAsia="ko-KR"/>
         </w:rPr>
-      </w:pPr>
-      <w:r>
-        <w:rPr>
-          <w:rFonts w:ascii="휴먼명조" w:eastAsia="휴먼명조" w:cs="휴먼명조" w:hint="eastAsia"/>
-          <w:b/>
-          <w:bCs/>
-          <w:sz w:val="24"/>
-          <w:szCs w:val="24"/>
-          <w:lang w:eastAsia="ko-KR"/>
-        </w:rPr>
-        <w:lastRenderedPageBreak/>
-        <w:t>4</w:t>
-      </w:r>
-      <w:r>
-        <w:rPr>
-          <w:rFonts w:ascii="휴먼명조" w:eastAsia="휴먼명조" w:cs="휴먼명조" w:hint="eastAsia"/>
-          <w:b/>
-          <w:bCs/>
-          <w:sz w:val="24"/>
-          <w:szCs w:val="24"/>
-          <w:lang w:eastAsia="ko-KR"/>
-        </w:rPr>
-        <w:t xml:space="preserve">. </w:t>
+        <w:t>Vulkan 백엔드 및 빛</w:t>
       </w:r>
       <w:r>
         <w:rPr>
@@ -15909,7 +15921,7 @@
           <w:szCs w:val="24"/>
           <w:lang w:eastAsia="ko-KR"/>
         </w:rPr>
-        <w:t>Vulkan 백엔드 및 빛</w:t>
+        <w:t>·</w:t>
       </w:r>
       <w:r>
         <w:rPr>
@@ -15920,18 +15932,7 @@
           <w:szCs w:val="24"/>
           <w:lang w:eastAsia="ko-KR"/>
         </w:rPr>
-        <w:t>·</w:t>
-      </w:r>
-      <w:r>
-        <w:rPr>
-          <w:rFonts w:ascii="휴먼명조" w:eastAsia="휴먼명조" w:cs="휴먼명조"/>
-          <w:b/>
-          <w:bCs/>
-          <w:sz w:val="24"/>
-          <w:szCs w:val="24"/>
-          <w:lang w:eastAsia="ko-KR"/>
-        </w:rPr>
-        <w:t>그림자 구현 기술</w:t>
+        <w:t>그림자 구현</w:t>
       </w:r>
     </w:p>
     <w:tbl>
@@ -16173,38 +16174,38 @@
             </w:pPr>
             <w:r>
               <w:rPr>
+                <w:rFonts w:ascii="휴먼명조" w:eastAsia="휴먼명조" w:cs="휴먼명조"/>
+                <w:lang w:eastAsia="ko-KR"/>
+              </w:rPr>
+              <w:t>Vulkan 백엔드 및 phong shading을 기반으로</w:t>
+            </w:r>
+            <w:r>
+              <w:rPr>
                 <w:rFonts w:ascii="휴먼명조" w:eastAsia="휴먼명조" w:cs="휴먼명조" w:hint="eastAsia"/>
                 <w:lang w:eastAsia="ko-KR"/>
               </w:rPr>
-              <w:t xml:space="preserve">Vulkan 백엔드 및 </w:t>
-            </w:r>
-            <w:r>
-              <w:rPr>
-                <w:rFonts w:ascii="휴먼명조" w:eastAsia="휴먼명조" w:cs="휴먼명조" w:hint="eastAsia"/>
-                <w:lang w:eastAsia="ko-KR"/>
-              </w:rPr>
-              <w:t>빛</w:t>
-            </w:r>
-            <w:r>
-              <w:rPr>
-                <w:rFonts w:ascii="휴먼명조" w:eastAsia="휴먼명조" w:cs="휴먼명조" w:hint="eastAsia"/>
+              <w:t xml:space="preserve"> </w:t>
+            </w:r>
+            <w:r>
+              <w:rPr>
+                <w:rFonts w:ascii="휴먼명조" w:eastAsia="휴먼명조" w:cs="휴먼명조"/>
+                <w:lang w:eastAsia="ko-KR"/>
+              </w:rPr>
+              <w:t>한 빛</w:t>
+            </w:r>
+            <w:r>
+              <w:rPr>
+                <w:rFonts w:ascii="휴먼명조" w:eastAsia="휴먼명조" w:cs="휴먼명조"/>
                 <w:lang w:eastAsia="ko-KR"/>
               </w:rPr>
               <w:t>·</w:t>
             </w:r>
             <w:r>
               <w:rPr>
-                <w:rFonts w:ascii="휴먼명조" w:eastAsia="휴먼명조" w:cs="휴먼명조" w:hint="eastAsia"/>
-                <w:lang w:eastAsia="ko-KR"/>
-              </w:rPr>
-              <w:t>그림자</w:t>
-            </w:r>
-            <w:r>
-              <w:rPr>
-                <w:rFonts w:ascii="휴먼명조" w:eastAsia="휴먼명조" w:cs="휴먼명조" w:hint="eastAsia"/>
-                <w:lang w:eastAsia="ko-KR"/>
-              </w:rPr>
-              <w:t xml:space="preserve"> 구현 기술</w:t>
+                <w:rFonts w:ascii="휴먼명조" w:eastAsia="휴먼명조" w:cs="휴먼명조"/>
+                <w:lang w:eastAsia="ko-KR"/>
+              </w:rPr>
+              <w:t>그림자 구현</w:t>
             </w:r>
           </w:p>
         </w:tc>
@@ -22204,6 +22205,7 @@
           <w:rFonts w:ascii="휴먼명조" w:eastAsia="휴먼명조"/>
           <w:sz w:val="24"/>
           <w:szCs w:val="24"/>
+          <w:lang w:eastAsia="ko-KR"/>
         </w:rPr>
       </w:pPr>
       <w:r>
@@ -22214,27 +22216,7 @@
           <w:sz w:val="24"/>
           <w:szCs w:val="24"/>
         </w:rPr>
-        <w:t xml:space="preserve">6) 설계 원칙 </w:t>
-      </w:r>
-      <w:r>
-        <w:rPr>
-          <w:rFonts w:ascii="Arial" w:eastAsia="휴먼명조" w:hAnsi="Arial" w:cs="Arial"/>
-          <w:b/>
-          <w:color w:val="111111"/>
-          <w:sz w:val="24"/>
-          <w:szCs w:val="24"/>
-        </w:rPr>
-        <w:t>—</w:t>
-      </w:r>
-      <w:r>
-        <w:rPr>
-          <w:rFonts w:ascii="휴먼명조" w:eastAsia="휴먼명조" w:hAnsi="Malgun Gothic" w:hint="eastAsia"/>
-          <w:b/>
-          <w:color w:val="111111"/>
-          <w:sz w:val="24"/>
-          <w:szCs w:val="24"/>
-        </w:rPr>
-        <w:t xml:space="preserve"> 모듈 경계 (Module Boundaries)</w:t>
+        <w:t>6) 설계 원칙</w:t>
       </w:r>
     </w:p>
     <w:p>
@@ -44407,7 +44389,6 @@
   <w:style w:type="character" w:default="1" w:styleId="a1">
     <w:name w:val="Default Paragraph Font"/>
     <w:uiPriority w:val="1"/>
-    <w:semiHidden/>
     <w:unhideWhenUsed/>
   </w:style>
   <w:style w:type="table" w:default="1" w:styleId="a2">

</xml_diff>